<commit_message>
denominator for the percenteges in the last three lines changed
</commit_message>
<xml_diff>
--- a/i_test/test_D6_Table_S1/g_output/D6_Table_S1_attrition_abira.docx
+++ b/i_test/test_D6_Table_S1/g_output/D6_Table_S1_attrition_abira.docx
@@ -270,7 +270,7 @@
               <w:pStyle w:val="Normal"/>
             </w:pPr>
             <w:r>
-              <w:t>319 (6,4%)</w:t>
+              <w:t>319 (37,2%)</w:t>
             </w:r>
           </w:p>
         </w:tc>
@@ -292,7 +292,7 @@
               <w:pStyle w:val="Normal"/>
             </w:pPr>
             <w:r>
-              <w:t>279 (5,6%)</w:t>
+              <w:t>279 (32,5%)</w:t>
             </w:r>
           </w:p>
         </w:tc>
@@ -314,7 +314,7 @@
               <w:pStyle w:val="Normal"/>
             </w:pPr>
             <w:r>
-              <w:t>260 (5,2%)</w:t>
+              <w:t>260 (30,3%)</w:t>
             </w:r>
           </w:p>
         </w:tc>

</xml_diff>